<commit_message>
docs(report): convert ASCII Observer flow → Mermaid PNG (diagram_16)
- diagram_16.mmd + diagram_16.png — flowchart cho Observer pattern:
  Service → ApplicationContext → 3 Listeners (Audit/Notification/Email)
  với label AFTER_COMMIT trên cạnh dashed
- Replace ASCII block trong Chương 7 (Pattern 3 - Observer)
- 16 hình embed trong docx (1.6MB → 1.65MB)

Co-Authored-By: Claude Opus 4.7 (1M context) <noreply@anthropic.com>
</commit_message>
<xml_diff>
--- a/DOCS/BaoCao_Nhom13_HeThongDatHangNhapKhau.docx
+++ b/DOCS/BaoCao_Nhom13_HeThongDatHangNhapKhau.docx
@@ -42005,7 +42005,7 @@
     </w:p>
     <w:bookmarkEnd w:id="156"/>
     <w:bookmarkEnd w:id="157"/>
-    <w:bookmarkStart w:id="200" w:name="chương-7-nguyên-lý-thiết-kế"/>
+    <w:bookmarkStart w:id="203" w:name="chương-7-nguyên-lý-thiết-kế"/>
     <w:p>
       <w:pPr>
         <w:pStyle w:val="Heading1"/>
@@ -47486,7 +47486,7 @@
     </w:p>
     <w:bookmarkEnd w:id="178"/>
     <w:bookmarkEnd w:id="179"/>
-    <w:bookmarkStart w:id="198" w:name="các-design-pattern-đã-áp-dụng"/>
+    <w:bookmarkStart w:id="201" w:name="các-design-pattern-đã-áp-dụng"/>
     <w:p>
       <w:pPr>
         <w:pStyle w:val="Heading2"/>
@@ -50057,7 +50057,7 @@
       </w:r>
     </w:p>
     <w:bookmarkEnd w:id="193"/>
-    <w:bookmarkStart w:id="194" w:name="X443c2264b611e1fc72fca5bb38e2fee33de26c6"/>
+    <w:bookmarkStart w:id="197" w:name="X443c2264b611e1fc72fca5bb38e2fee33de26c6"/>
     <w:p>
       <w:pPr>
         <w:pStyle w:val="Heading3"/>
@@ -50212,99 +50212,121 @@
     </w:p>
     <w:p>
       <w:pPr>
-        <w:pStyle w:val="SourceCode"/>
-      </w:pPr>
+        <w:pStyle w:val="CaptionedFigure"/>
+      </w:pPr>
+      <w:r>
+        <w:drawing>
+          <wp:inline>
+            <wp:extent cx="5334000" cy="3755495"/>
+            <wp:effectExtent b="0" l="0" r="0" t="0"/>
+            <wp:docPr descr="Cấu trúc Observer Pattern — Service publish event, 3 Listener subscribe AFTER_COMMIT" title="" id="195" name="Picture"/>
+            <a:graphic>
+              <a:graphicData uri="http://schemas.openxmlformats.org/drawingml/2006/picture">
+                <pic:pic>
+                  <pic:nvPicPr>
+                    <pic:cNvPr descr="images/diagram_16.png" id="196" name="Picture"/>
+                    <pic:cNvPicPr>
+                      <a:picLocks noChangeArrowheads="1" noChangeAspect="1"/>
+                    </pic:cNvPicPr>
+                  </pic:nvPicPr>
+                  <pic:blipFill>
+                    <a:blip r:embed="rId194"/>
+                    <a:stretch>
+                      <a:fillRect/>
+                    </a:stretch>
+                  </pic:blipFill>
+                  <pic:spPr bwMode="auto">
+                    <a:xfrm>
+                      <a:off x="0" y="0"/>
+                      <a:ext cx="5334000" cy="3755495"/>
+                    </a:xfrm>
+                    <a:prstGeom prst="rect">
+                      <a:avLst/>
+                    </a:prstGeom>
+                    <a:noFill/>
+                    <a:ln w="9525">
+                      <a:noFill/>
+                      <a:headEnd/>
+                      <a:tailEnd/>
+                    </a:ln>
+                  </pic:spPr>
+                </pic:pic>
+              </a:graphicData>
+            </a:graphic>
+          </wp:inline>
+        </w:drawing>
+      </w:r>
+    </w:p>
+    <w:p>
+      <w:pPr>
+        <w:pStyle w:val="ImageCaption"/>
+      </w:pPr>
+      <w:r>
+        <w:t xml:space="preserve">Cấu trúc Observer Pattern — Service publish event, 3 Listener subscribe AFTER_COMMIT</w:t>
+      </w:r>
+    </w:p>
+    <w:p>
+      <w:pPr>
+        <w:pStyle w:val="BodyText"/>
+      </w:pPr>
+      <w:r>
+        <w:t xml:space="preserve">Sơ đồ trên thể hiện rõ sự tách bạch:</w:t>
+      </w:r>
+      <w:r>
+        <w:t xml:space="preserve"> </w:t>
+      </w:r>
       <w:r>
         <w:rPr>
           <w:rStyle w:val="VerbatimChar"/>
         </w:rPr>
-        <w:t xml:space="preserve">PurchaseOrderService.confirmPO()</w:t>
-      </w:r>
-      <w:r>
-        <w:br/>
+        <w:t xml:space="preserve">PurchaseOrderService</w:t>
+      </w:r>
+      <w:r>
+        <w:t xml:space="preserve"> </w:t>
+      </w:r>
+      <w:r>
+        <w:t xml:space="preserve">chỉ làm một việc duy nhất là</w:t>
+      </w:r>
+      <w:r>
+        <w:t xml:space="preserve"> </w:t>
       </w:r>
       <w:r>
         <w:rPr>
           <w:rStyle w:val="VerbatimChar"/>
         </w:rPr>
-        <w:t xml:space="preserve">   └─→ eventPublisher.publishEvent(new POConfirmedEvent(po))</w:t>
-      </w:r>
-      <w:r>
-        <w:br/>
+        <w:t xml:space="preserve">publishEvent(...)</w:t>
+      </w:r>
+      <w:r>
+        <w:t xml:space="preserve">, không hề biết có ai đang lắng nghe. Spring</w:t>
+      </w:r>
+      <w:r>
+        <w:t xml:space="preserve"> </w:t>
       </w:r>
       <w:r>
         <w:rPr>
           <w:rStyle w:val="VerbatimChar"/>
         </w:rPr>
-        <w:t xml:space="preserve">            ↓</w:t>
-      </w:r>
-      <w:r>
-        <w:br/>
+        <w:t xml:space="preserve">ApplicationContext</w:t>
+      </w:r>
+      <w:r>
+        <w:t xml:space="preserve"> </w:t>
+      </w:r>
+      <w:r>
+        <w:t xml:space="preserve">đóng vai trò Event Bus — tự định tuyến event tới đúng các listener đã subscribe. Mũi tên đứt nét (</w:t>
       </w:r>
       <w:r>
         <w:rPr>
           <w:rStyle w:val="VerbatimChar"/>
         </w:rPr>
-        <w:t xml:space="preserve">         [Spring ApplicationContext]</w:t>
-      </w:r>
-      <w:r>
-        <w:br/>
-      </w:r>
-      <w:r>
-        <w:rPr>
-          <w:rStyle w:val="VerbatimChar"/>
-        </w:rPr>
-        <w:t xml:space="preserve">            ↓</w:t>
-      </w:r>
-      <w:r>
-        <w:br/>
-      </w:r>
-      <w:r>
-        <w:rPr>
-          <w:rStyle w:val="VerbatimChar"/>
-        </w:rPr>
-        <w:t xml:space="preserve">   ┌────────┼────────┐</w:t>
-      </w:r>
-      <w:r>
-        <w:br/>
-      </w:r>
-      <w:r>
-        <w:rPr>
-          <w:rStyle w:val="VerbatimChar"/>
-        </w:rPr>
-        <w:t xml:space="preserve">   ↓        ↓        ↓</w:t>
-      </w:r>
-      <w:r>
-        <w:br/>
-      </w:r>
-      <w:r>
-        <w:rPr>
-          <w:rStyle w:val="VerbatimChar"/>
-        </w:rPr>
-        <w:t xml:space="preserve">POAudit   PONotify  POEmail</w:t>
-      </w:r>
-      <w:r>
-        <w:br/>
-      </w:r>
-      <w:r>
-        <w:rPr>
-          <w:rStyle w:val="VerbatimChar"/>
-        </w:rPr>
-        <w:t xml:space="preserve">Listener  Listener  Listener</w:t>
-      </w:r>
-      <w:r>
-        <w:br/>
-      </w:r>
-      <w:r>
-        <w:rPr>
-          <w:rStyle w:val="VerbatimChar"/>
-        </w:rPr>
-        <w:t xml:space="preserve">(@TransactionalEventListener AFTER_COMMIT)</w:t>
-      </w:r>
-    </w:p>
-    <w:p>
-      <w:pPr>
-        <w:pStyle w:val="FirstParagraph"/>
+        <w:t xml:space="preserve">--&gt;</w:t>
+      </w:r>
+      <w:r>
+        <w:t xml:space="preserve">) thể hiện đây là loose coupling — listener có thể tăng giảm tuỳ ý mà service không cần thay đổi.</w:t>
+      </w:r>
+    </w:p>
+    <w:p>
+      <w:pPr>
+        <w:pStyle w:val="BodyText"/>
       </w:pPr>
       <w:r>
         <w:rPr>
@@ -50646,8 +50668,8 @@
         <w:t xml:space="preserve">}</w:t>
       </w:r>
     </w:p>
-    <w:bookmarkEnd w:id="194"/>
-    <w:bookmarkStart w:id="195" w:name="X4c3c9bf22f9182402c99c2b57e6e087f9ae08d6"/>
+    <w:bookmarkEnd w:id="197"/>
+    <w:bookmarkStart w:id="198" w:name="X4c3c9bf22f9182402c99c2b57e6e087f9ae08d6"/>
     <w:p>
       <w:pPr>
         <w:pStyle w:val="Heading3"/>
@@ -50841,8 +50863,8 @@
         <w:t xml:space="preserve">Code dễ đọc, mỗi class &lt; 20 dòng.</w:t>
       </w:r>
     </w:p>
-    <w:bookmarkEnd w:id="195"/>
-    <w:bookmarkStart w:id="196" w:name="X56ca5363aaff56259c6102fa1f0c6554620d9f0"/>
+    <w:bookmarkEnd w:id="198"/>
+    <w:bookmarkStart w:id="199" w:name="X56ca5363aaff56259c6102fa1f0c6554620d9f0"/>
     <w:p>
       <w:pPr>
         <w:pStyle w:val="Heading3"/>
@@ -52363,8 +52385,8 @@
         </w:tc>
       </w:tr>
     </w:tbl>
-    <w:bookmarkEnd w:id="196"/>
-    <w:bookmarkStart w:id="197" w:name="pattern-6-mapper-pattern-entity-dto"/>
+    <w:bookmarkEnd w:id="199"/>
+    <w:bookmarkStart w:id="200" w:name="pattern-6-mapper-pattern-entity-dto"/>
     <w:p>
       <w:pPr>
         <w:pStyle w:val="Heading3"/>
@@ -52875,9 +52897,9 @@
         </w:tc>
       </w:tr>
     </w:tbl>
-    <w:bookmarkEnd w:id="197"/>
-    <w:bookmarkEnd w:id="198"/>
-    <w:bookmarkStart w:id="199" w:name="tổng-kết-chương-7"/>
+    <w:bookmarkEnd w:id="200"/>
+    <w:bookmarkEnd w:id="201"/>
+    <w:bookmarkStart w:id="202" w:name="tổng-kết-chương-7"/>
     <w:p>
       <w:pPr>
         <w:pStyle w:val="Heading2"/>
@@ -53275,9 +53297,9 @@
         <w:t xml:space="preserve">.</w:t>
       </w:r>
     </w:p>
-    <w:bookmarkEnd w:id="199"/>
-    <w:bookmarkEnd w:id="200"/>
-    <w:bookmarkStart w:id="216" w:name="chương-8-hướng-dẫn-cài-đặt"/>
+    <w:bookmarkEnd w:id="202"/>
+    <w:bookmarkEnd w:id="203"/>
+    <w:bookmarkStart w:id="219" w:name="chương-8-hướng-dẫn-cài-đặt"/>
     <w:p>
       <w:pPr>
         <w:pStyle w:val="Heading1"/>
@@ -53286,7 +53308,7 @@
         <w:t xml:space="preserve">Chương 8: Hướng dẫn cài đặt</w:t>
       </w:r>
     </w:p>
-    <w:bookmarkStart w:id="201" w:name="đối-tượng-và-phạm-vi-sử-dụng"/>
+    <w:bookmarkStart w:id="204" w:name="đối-tượng-và-phạm-vi-sử-dụng"/>
     <w:p>
       <w:pPr>
         <w:pStyle w:val="Heading2"/>
@@ -53421,8 +53443,8 @@
         <w:t xml:space="preserve">kiểm nhận hàng.</w:t>
       </w:r>
     </w:p>
-    <w:bookmarkEnd w:id="201"/>
-    <w:bookmarkStart w:id="205" w:name="yêu-cầu-hệ-thống"/>
+    <w:bookmarkEnd w:id="204"/>
+    <w:bookmarkStart w:id="208" w:name="yêu-cầu-hệ-thống"/>
     <w:p>
       <w:pPr>
         <w:pStyle w:val="Heading2"/>
@@ -53431,7 +53453,7 @@
         <w:t xml:space="preserve">8.2 Yêu cầu hệ thống</w:t>
       </w:r>
     </w:p>
-    <w:bookmarkStart w:id="202" w:name="phần-cứng-tối-thiểu"/>
+    <w:bookmarkStart w:id="205" w:name="phần-cứng-tối-thiểu"/>
     <w:p>
       <w:pPr>
         <w:pStyle w:val="Heading3"/>
@@ -53476,8 +53498,8 @@
         <w:t xml:space="preserve">Ổ cứng: 5 GB trống</w:t>
       </w:r>
     </w:p>
-    <w:bookmarkEnd w:id="202"/>
-    <w:bookmarkStart w:id="203" w:name="phần-mềm"/>
+    <w:bookmarkEnd w:id="205"/>
+    <w:bookmarkStart w:id="206" w:name="phần-mềm"/>
     <w:p>
       <w:pPr>
         <w:pStyle w:val="Heading3"/>
@@ -53546,8 +53568,8 @@
         <w:t xml:space="preserve">(Tuỳ chọn) Docker + Docker Compose nếu muốn dùng container</w:t>
       </w:r>
     </w:p>
-    <w:bookmarkEnd w:id="203"/>
-    <w:bookmarkStart w:id="204" w:name="trình-duyệt-được-hỗ-trợ"/>
+    <w:bookmarkEnd w:id="206"/>
+    <w:bookmarkStart w:id="207" w:name="trình-duyệt-được-hỗ-trợ"/>
     <w:p>
       <w:pPr>
         <w:pStyle w:val="Heading3"/>
@@ -53604,9 +53626,9 @@
         <w:t xml:space="preserve">Safari 15+</w:t>
       </w:r>
     </w:p>
-    <w:bookmarkEnd w:id="204"/>
-    <w:bookmarkEnd w:id="205"/>
-    <w:bookmarkStart w:id="211" w:name="hướng-dẫn-cài-đặt"/>
+    <w:bookmarkEnd w:id="207"/>
+    <w:bookmarkEnd w:id="208"/>
+    <w:bookmarkStart w:id="214" w:name="hướng-dẫn-cài-đặt"/>
     <w:p>
       <w:pPr>
         <w:pStyle w:val="Heading2"/>
@@ -53615,7 +53637,7 @@
         <w:t xml:space="preserve">8.3 Hướng dẫn cài đặt</w:t>
       </w:r>
     </w:p>
-    <w:bookmarkStart w:id="209" w:name="cách-1-chạy-local-với-xampp-dành-cho-dev"/>
+    <w:bookmarkStart w:id="212" w:name="cách-1-chạy-local-với-xampp-dành-cho-dev"/>
     <w:p>
       <w:pPr>
         <w:pStyle w:val="Heading3"/>
@@ -53718,7 +53740,7 @@
       <w:r>
         <w:t xml:space="preserve"> </w:t>
       </w:r>
-      <w:hyperlink r:id="rId206">
+      <w:hyperlink r:id="rId209">
         <w:r>
           <w:rPr>
             <w:rStyle w:val="Hyperlink"/>
@@ -53865,7 +53887,7 @@
       <w:r>
         <w:t xml:space="preserve"> </w:t>
       </w:r>
-      <w:hyperlink r:id="rId207">
+      <w:hyperlink r:id="rId210">
         <w:r>
           <w:rPr>
             <w:rStyle w:val="Hyperlink"/>
@@ -53966,7 +53988,7 @@
       <w:r>
         <w:t xml:space="preserve"> </w:t>
       </w:r>
-      <w:hyperlink r:id="rId208">
+      <w:hyperlink r:id="rId211">
         <w:r>
           <w:rPr>
             <w:rStyle w:val="Hyperlink"/>
@@ -53978,8 +54000,8 @@
         <w:t xml:space="preserve">. Mở trình duyệt vào địa chỉ này.</w:t>
       </w:r>
     </w:p>
-    <w:bookmarkEnd w:id="209"/>
-    <w:bookmarkStart w:id="210" w:name="Xe1533ca7fa2cea3d6f9fe1cdb6f084d6a0141d0"/>
+    <w:bookmarkEnd w:id="212"/>
+    <w:bookmarkStart w:id="213" w:name="Xe1533ca7fa2cea3d6f9fe1cdb6f084d6a0141d0"/>
     <w:p>
       <w:pPr>
         <w:pStyle w:val="Heading3"/>
@@ -54095,9 +54117,9 @@
         <w:t xml:space="preserve">--build</w:t>
       </w:r>
     </w:p>
-    <w:bookmarkEnd w:id="210"/>
-    <w:bookmarkEnd w:id="211"/>
-    <w:bookmarkStart w:id="215" w:name="hướng-dẫn-sử-dụng"/>
+    <w:bookmarkEnd w:id="213"/>
+    <w:bookmarkEnd w:id="214"/>
+    <w:bookmarkStart w:id="218" w:name="hướng-dẫn-sử-dụng"/>
     <w:p>
       <w:pPr>
         <w:pStyle w:val="Heading2"/>
@@ -54106,7 +54128,7 @@
         <w:t xml:space="preserve">8.4 Hướng dẫn sử dụng</w:t>
       </w:r>
     </w:p>
-    <w:bookmarkStart w:id="212" w:name="đăng-nhập"/>
+    <w:bookmarkStart w:id="215" w:name="đăng-nhập"/>
     <w:p>
       <w:pPr>
         <w:pStyle w:val="Heading3"/>
@@ -54125,7 +54147,7 @@
       <w:r>
         <w:t xml:space="preserve"> </w:t>
       </w:r>
-      <w:hyperlink r:id="rId208">
+      <w:hyperlink r:id="rId211">
         <w:r>
           <w:rPr>
             <w:rStyle w:val="Hyperlink"/>
@@ -54522,8 +54544,8 @@
         </w:tc>
       </w:tr>
     </w:tbl>
-    <w:bookmarkEnd w:id="212"/>
-    <w:bookmarkStart w:id="213" w:name="luồng-demo-gợi-ý"/>
+    <w:bookmarkEnd w:id="215"/>
+    <w:bookmarkStart w:id="216" w:name="luồng-demo-gợi-ý"/>
     <w:p>
       <w:pPr>
         <w:pStyle w:val="Heading3"/>
@@ -54783,8 +54805,8 @@
         <w:t xml:space="preserve">Warehouse gửi message cho Site. Site đăng nhập, mở discrepancy, phản hồi. Warehouse mark resolved.</w:t>
       </w:r>
     </w:p>
-    <w:bookmarkEnd w:id="213"/>
-    <w:bookmarkStart w:id="214" w:name="lưu-ý-khi-sử-dụng"/>
+    <w:bookmarkEnd w:id="216"/>
+    <w:bookmarkStart w:id="217" w:name="lưu-ý-khi-sử-dụng"/>
     <w:p>
       <w:pPr>
         <w:pStyle w:val="Heading3"/>
@@ -54883,10 +54905,10 @@
         <w:t xml:space="preserve">, hoặc dùng nút VI/EN ở góc phải trên AppBar.</w:t>
       </w:r>
     </w:p>
-    <w:bookmarkEnd w:id="214"/>
-    <w:bookmarkEnd w:id="215"/>
-    <w:bookmarkEnd w:id="216"/>
-    <w:bookmarkStart w:id="218" w:name="nhật-ký-làm-việc-nhóm"/>
+    <w:bookmarkEnd w:id="217"/>
+    <w:bookmarkEnd w:id="218"/>
+    <w:bookmarkEnd w:id="219"/>
+    <w:bookmarkStart w:id="221" w:name="nhật-ký-làm-việc-nhóm"/>
     <w:p>
       <w:pPr>
         <w:pStyle w:val="Heading1"/>
@@ -55479,7 +55501,7 @@
         </w:tc>
       </w:tr>
     </w:tbl>
-    <w:bookmarkStart w:id="217" w:name="đóng-góp-của-các-thành-viên"/>
+    <w:bookmarkStart w:id="220" w:name="đóng-góp-của-các-thành-viên"/>
     <w:p>
       <w:pPr>
         <w:pStyle w:val="Heading2"/>
@@ -55853,8 +55875,8 @@
         <w:t xml:space="preserve">Hết —</w:t>
       </w:r>
     </w:p>
-    <w:bookmarkEnd w:id="217"/>
-    <w:bookmarkEnd w:id="218"/>
+    <w:bookmarkEnd w:id="220"/>
+    <w:bookmarkEnd w:id="221"/>
     <w:sectPr>
       <w:footnotePr>
         <w:numRestart w:val="eachSect"/>

</xml_diff>